<commit_message>
Adiciona versão calibrada para a vaga de Comunicação Interna B2C
- Unifica a geração de HTML e DOCX em gerar_cv.py, com o conteúdo das
  versões em conteudo.py e o render.js gerando os dois PDFs
- Nova versão com o vocabulário da descrição da vaga: ponto focal,
  calendário de comunicações, rituais de comunicação, conteúdo para
  canais corporativos, campanhas de engajamento e reconhecimento,
  múltiplos projetos simultâneos, relatórios e análise de dados
- Reordena os bullets para liderar com as entregas mais aderentes

Co-Authored-By: Claude Opus 5 <noreply@anthropic.com>
Claude-Session: https://claude.ai/code/session_016xA7Phxjtmgw26NpqfpKyN
</commit_message>
<xml_diff>
--- a/curriculo/Renata-Xavier-Comunicacao-Interna-Endomarketing.docx
+++ b/curriculo/Renata-Xavier-Comunicacao-Interna-Endomarketing.docx
@@ -427,7 +427,39 @@
           <w:color w:val="000000"/>
           <w:sz w:val="21"/>
         </w:rPr>
-        <w:t>Conduzi o plano de comunicação interna de uma operação nacional com mais de 800 colaboradores e 26 unidades no Brasil, articulando agentes de comunicação locais e garantindo padronização e efetividade na disseminação de informações.</w:t>
+        <w:t xml:space="preserve">Conduzi o plano de comunicação interna de uma operação nacional com mais de </w:t>
+      </w:r>
+      <w:r>
+        <w:rPr>
+          <w:b/>
+          <w:color w:val="000000"/>
+          <w:sz w:val="21"/>
+        </w:rPr>
+        <w:t>800 colaboradores</w:t>
+      </w:r>
+      <w:r>
+        <w:rPr>
+          <w:b w:val="0"/>
+          <w:color w:val="000000"/>
+          <w:sz w:val="21"/>
+        </w:rPr>
+        <w:t xml:space="preserve"> e </w:t>
+      </w:r>
+      <w:r>
+        <w:rPr>
+          <w:b/>
+          <w:color w:val="000000"/>
+          <w:sz w:val="21"/>
+        </w:rPr>
+        <w:t>26 unidades</w:t>
+      </w:r>
+      <w:r>
+        <w:rPr>
+          <w:b w:val="0"/>
+          <w:color w:val="000000"/>
+          <w:sz w:val="21"/>
+        </w:rPr>
+        <w:t xml:space="preserve"> no Brasil, articulando agentes de comunicação locais e garantindo padronização e efetividade na disseminação de informações.</w:t>
       </w:r>
     </w:p>
     <w:p>
@@ -472,7 +504,23 @@
           <w:color w:val="000000"/>
           <w:sz w:val="21"/>
         </w:rPr>
-        <w:t>Liderei a frente de Diversidade e Inclusão: comitê com reuniões mensais, campanhas de conscientização e sensibilização, workshops e palestras corporativas, consolidando uma cultura inclusiva.</w:t>
+        <w:t xml:space="preserve">Liderei a frente de </w:t>
+      </w:r>
+      <w:r>
+        <w:rPr>
+          <w:b/>
+          <w:color w:val="000000"/>
+          <w:sz w:val="21"/>
+        </w:rPr>
+        <w:t>Diversidade e Inclusão</w:t>
+      </w:r>
+      <w:r>
+        <w:rPr>
+          <w:b w:val="0"/>
+          <w:color w:val="000000"/>
+          <w:sz w:val="21"/>
+        </w:rPr>
+        <w:t>: comitê com reuniões mensais, campanhas de conscientização e sensibilização, workshops e palestras corporativas, consolidando uma cultura inclusiva.</w:t>
       </w:r>
     </w:p>
     <w:p>
@@ -487,7 +535,23 @@
           <w:color w:val="000000"/>
           <w:sz w:val="21"/>
         </w:rPr>
-        <w:t>Liderei o censo de diversidade de 2025, da coleta à análise dos dados, transformando os resultados em oportunidades de melhoria e estratégias inclusivas para a empresa.</w:t>
+        <w:t xml:space="preserve">Liderei o </w:t>
+      </w:r>
+      <w:r>
+        <w:rPr>
+          <w:b/>
+          <w:color w:val="000000"/>
+          <w:sz w:val="21"/>
+        </w:rPr>
+        <w:t>censo de diversidade de 2025</w:t>
+      </w:r>
+      <w:r>
+        <w:rPr>
+          <w:b w:val="0"/>
+          <w:color w:val="000000"/>
+          <w:sz w:val="21"/>
+        </w:rPr>
+        <w:t>, da coleta à análise dos dados, transformando os resultados em oportunidades de melhoria e estratégias inclusivas para a empresa.</w:t>
       </w:r>
     </w:p>
     <w:p>
@@ -517,7 +581,23 @@
           <w:color w:val="000000"/>
           <w:sz w:val="21"/>
         </w:rPr>
-        <w:t>Conduzi o ciclo de Avaliação de Desempenho, com uso da plataforma de avaliação, suporte a gestores e calibrações de mais de 800 colaboradores.</w:t>
+        <w:t xml:space="preserve">Conduzi o ciclo de </w:t>
+      </w:r>
+      <w:r>
+        <w:rPr>
+          <w:b/>
+          <w:color w:val="000000"/>
+          <w:sz w:val="21"/>
+        </w:rPr>
+        <w:t>Avaliação de Desempenho</w:t>
+      </w:r>
+      <w:r>
+        <w:rPr>
+          <w:b w:val="0"/>
+          <w:color w:val="000000"/>
+          <w:sz w:val="21"/>
+        </w:rPr>
+        <w:t>, com uso da plataforma de avaliação, suporte a gestores e calibrações de mais de 800 colaboradores.</w:t>
       </w:r>
     </w:p>
     <w:p>

</xml_diff>